<commit_message>
Match proposal headers to supplied P026-168 template
</commit_message>
<xml_diff>
--- a/data/templates/standard_proposal.docx
+++ b/data/templates/standard_proposal.docx
@@ -8,104 +8,64 @@
           <w:tab w:val="right" w:pos="9900"/>
         </w:tabs>
         <w:spacing w:after="360"/>
-        <w:rPr>
-          <w:lang w:eastAsia="zh-CN"/>
-        </w:rPr>
       </w:pPr>
       <w:r>
-        <w:t xml:space="preserve">October 28, </w:t>
-      </w:r>
-      <w:proofErr w:type="gramStart"/>
-      <w:r>
-        <w:t>2026</w:t>
-      </w:r>
-      <w:proofErr w:type="gramEnd"/>
-      <w:r>
+        <w:t>September 24, 2026</w:t>
         <w:tab/>
         <w:t>Almor Proposal No.: [Proposal Number]</w:t>
       </w:r>
     </w:p>
     <w:p>
       <w:pPr>
-        <w:tabs>
-          <w:tab w:val="left" w:pos="6799"/>
-        </w:tabs>
-        <w:spacing w:after="0"/>
-        <w:ind w:left="720" w:hanging="720"/>
         <w:rPr>
-          <w:color w:val="806000" w:themeColor="accent4" w:themeShade="80"/>
+          <w:rStyle w:val="apple-style-span"/>
         </w:rPr>
       </w:pPr>
       <w:r>
-        <w:t xml:space="preserve">Attention: </w:t>
-      </w:r>
-      <w:r>
-        <w:t xml:space="preserve">Ms. </w:t>
-      </w:r>
-      <w:r>
-        <w:t xml:space="preserve">Client Contact | </w:t>
-      </w:r>
-      <w:r>
-        <w:rPr>
-          <w:color w:val="806000" w:themeColor="accent4" w:themeShade="80"/>
-        </w:rPr>
-        <w:t>client@example.com</w:t>
-      </w:r>
-      <w:r>
-        <w:rPr>
-          <w:color w:val="806000" w:themeColor="accent4" w:themeShade="80"/>
-        </w:rPr>
-        <w:tab/>
+        <w:t>Client Name</w:t>
+        <w:br/>
+        <w:t>Client Address</w:t>
+        <w:br/>
+        <w:t>Client City, Province</w:t>
+        <w:br/>
+        <w:t>Postal Code</w:t>
       </w:r>
     </w:p>
     <w:p>
       <w:pPr>
         <w:tabs>
-          <w:tab w:val="left" w:pos="6799"/>
+          <w:tab w:val="left" w:pos="7211"/>
         </w:tabs>
+        <w:spacing w:after="360"/>
+        <w:rPr>
+          <w:lang w:val="en-CA"/>
+        </w:rPr>
+      </w:pPr>
+      <w:r>
+        <w:t>Attention: Client Contact | client@example.com</w:t>
+      </w:r>
+    </w:p>
+    <w:p>
+      <w:pPr>
         <w:spacing w:after="0"/>
         <w:ind w:left="720" w:hanging="720"/>
       </w:pPr>
+      <w:r>
+        <w:t>Re:</w:t>
+        <w:tab/>
+        <w:t>Request for Proposal for Geotechnical Services</w:t>
+      </w:r>
     </w:p>
     <w:p>
       <w:pPr>
         <w:spacing w:after="0"/>
-        <w:ind w:left="1440" w:hanging="720"/>
+        <w:ind w:left="720"/>
         <w:rPr>
           <w:lang w:eastAsia="zh-CN"/>
         </w:rPr>
       </w:pPr>
       <w:r>
-        <w:rPr>
-          <w:lang w:eastAsia="zh-CN"/>
-        </w:rPr>
-        <w:t>Re:</w:t>
-      </w:r>
-      <w:r>
-        <w:rPr>
-          <w:lang w:eastAsia="zh-CN"/>
-        </w:rPr>
-        <w:tab/>
-        <w:t>Request for Proposal for Geotechnical Services</w:t>
-      </w:r>
-      <w:r>
-        <w:rPr>
-          <w:lang w:eastAsia="zh-CN"/>
-        </w:rPr>
-        <w:br/>
-        <w:t xml:space="preserve">Project Name </w:t>
-      </w:r>
-      <w:r>
-        <w:rPr>
-          <w:lang w:eastAsia="zh-CN"/>
-        </w:rPr>
-        <w:br/>
-        <w:t>Project Address</w:t>
-      </w:r>
-      <w:r>
-        <w:rPr>
-          <w:lang w:eastAsia="zh-CN"/>
-        </w:rPr>
+        <w:t>Project Name</w:t>
         <w:br/>
         <w:t>Project Location</w:t>
       </w:r>
@@ -122,17 +82,12 @@
     <w:p>
       <w:pPr>
         <w:pStyle w:val="Body"/>
+        <w:rPr>
+          <w:lang w:eastAsia="zh-CN"/>
+        </w:rPr>
       </w:pPr>
       <w:r>
-        <w:t xml:space="preserve">At the request of the Client, Almor Testing Services Ltd. (Almor) is pleased to provide this proposal for geotechnical engineering services for the above-noted project.  The purpose of the investigation is to advance </w:t>
-      </w:r>
-      <w:proofErr w:type="gramStart"/>
-      <w:r>
-        <w:t>boreholes ,</w:t>
-      </w:r>
-      <w:proofErr w:type="gramEnd"/>
-      <w:r>
-        <w:t xml:space="preserve"> to determine the thickness of the asphaltic concrete, base and subbase and to the evaluate the subgrade soil characteristics for the subject road.  .</w:t>
+        <w:t>At the request of the Client, Almor Testing Services Ltd. (Almor) is pleased to provide this proposal for geotechnical engineering services for the above-noted project.</w:t>
       </w:r>
     </w:p>
     <w:p>
@@ -140,110 +95,6 @@
         <w:pStyle w:val="Heading1"/>
       </w:pPr>
       <w:r>
-        <w:t>Proposed Project Personnel</w:t>
-      </w:r>
-    </w:p>
-    <w:p>
-      <w:pPr>
-        <w:pStyle w:val="Body"/>
-      </w:pPr>
-      <w:r>
-        <w:t>Almor has extensive experience in geotechnical and materials engineering, including pavement assessments, subsurface investigations, and construction quality assurance. The proposed team has a proven record of planning, implementing, and evaluating geotechnical investigations and providing engineering recommendations for infrastructure and development projects.</w:t>
-      </w:r>
-    </w:p>
-    <w:p>
-      <w:pPr>
-        <w:pStyle w:val="Body"/>
-        <w:rPr>
-          <w:b/>
-          <w:bCs/>
-        </w:rPr>
-      </w:pPr>
-      <w:r>
-        <w:rPr>
-          <w:b/>
-          <w:bCs/>
-        </w:rPr>
-        <w:t xml:space="preserve">Project Manager – </w:t>
-      </w:r>
-      <w:r>
-        <w:rPr>
-          <w:b/>
-          <w:bCs/>
-        </w:rPr>
-        <w:t>Jason Morozoff</w:t>
-      </w:r>
-      <w:r>
-        <w:rPr>
-          <w:b/>
-          <w:bCs/>
-        </w:rPr>
-        <w:t>, P.Eng.</w:t>
-      </w:r>
-    </w:p>
-    <w:p>
-      <w:pPr>
-        <w:pStyle w:val="Body"/>
-      </w:pPr>
-      <w:r>
-        <w:t>Mr. Morozoff, P.Eng., is Almor’s principal officer and a project engineer. He has more than 25 years of industry experience in geotechnical investigations, settlement analysis for deep fills and structural loads, grout mix design for structural and soil stabilization, project management, tender preparation, field operations, and quality control and assurance.</w:t>
-      </w:r>
-    </w:p>
-    <w:p>
-      <w:pPr>
-        <w:pStyle w:val="Body"/>
-        <w:rPr>
-          <w:b/>
-          <w:bCs/>
-        </w:rPr>
-      </w:pPr>
-      <w:r>
-        <w:rPr>
-          <w:b/>
-          <w:bCs/>
-        </w:rPr>
-        <w:t>Project Engineer – Abdul Alemi, P.Eng.</w:t>
-      </w:r>
-    </w:p>
-    <w:p>
-      <w:pPr>
-        <w:pStyle w:val="Body"/>
-      </w:pPr>
-      <w:r>
-        <w:t>Mr. Alemi, P.Eng., has more than 15 years of experience in geotechnical engineering, construction monitoring, and the management of geotechnical and materials testing projects. He will coordinate the fieldwork and develop the geotechnical and materials engineering recommendations for this project.</w:t>
-      </w:r>
-    </w:p>
-    <w:p>
-      <w:pPr>
-        <w:pStyle w:val="Body"/>
-      </w:pPr>
-      <w:r>
-        <w:t>Mr. Alemi’s engineering experience includes geotechnical site characterization, trenchless crossings, deep and shallow foundation design, pavement design and assessment, settlement analysis, and general site interpretation and recommendations.</w:t>
-      </w:r>
-    </w:p>
-    <w:p>
-      <w:pPr>
-        <w:pStyle w:val="Body"/>
-      </w:pPr>
-      <w:r>
-        <w:t xml:space="preserve">Junior staff may be used under the direction </w:t>
-      </w:r>
-      <w:r>
-        <w:t xml:space="preserve">and guidance </w:t>
-      </w:r>
-      <w:r>
-        <w:t xml:space="preserve">of Mr. </w:t>
-      </w:r>
-      <w:r>
-        <w:t>Morozoff and Mr. Alemi.</w:t>
-      </w:r>
-    </w:p>
-    <w:p>
-      <w:pPr>
-        <w:pStyle w:val="Heading1"/>
-      </w:pPr>
-      <w:r>
-        <w:lastRenderedPageBreak/>
         <w:t>Scope of Work and Cost Summary</w:t>
       </w:r>
     </w:p>
@@ -271,15 +122,7 @@
         </w:rPr>
       </w:pPr>
       <w:r>
-        <w:t xml:space="preserve">Based on information supplied by the Client, Almor provides the following estimated cost to perform the geotechnical assessment and any additional work directed by the Client will constitute a change in the scope of work.  The geotechnical field program could be initiated within two weeks subject to rig availability and locates, </w:t>
-      </w:r>
-      <w:proofErr w:type="gramStart"/>
-      <w:r>
-        <w:t>subsequent to</w:t>
-      </w:r>
-      <w:proofErr w:type="gramEnd"/>
-      <w:r>
-        <w:t xml:space="preserve"> authorization. The estimated costs do not include environmental considerations of the development.  The field program will include geotechnical boreholes advanced using a track mounted solid stem auger drilling rig. It is our understanding access and clearing, if required, to the boreholes is suitable for a track mounted drilling rig and will be provided by the client as this work is outside the scope of our proposal.  The proposed scope of work for this project includes:</w:t>
+        <w:t>The purpose of the geotechnical program is to provide geotechnical investigation services as input for the construction of the proposed multi-family residential development. Based on information supplied by the Client, Almor provides the following estimated cost to perform the geotechnical assessment and any additional work directed by the Client will constitute a change in the scope of work.  The geotechnical field program could be initiated within two weeks subject to rig availability and locates, subsequent to authorization. The estimated costs do not include environmental considerations of the development.  The field program will include geotechnical boreholes advanced using a track mounted solid stem auger drilling rig. It is our understanding access and clearing, if required, to the boreholes is suitable for a track mounted drilling rig and will be provided by the client as this work is outside the scope of our proposal.  The proposed scope of work for this project includes:</w:t>
       </w:r>
     </w:p>
     <w:p>
@@ -303,20 +146,11 @@
         </w:numPr>
       </w:pPr>
       <w:r>
-        <w:t>Coring through existing pavement will be completed, where required, to facilitate geotechnical drilling.</w:t>
-      </w:r>
-      <w:r>
         <w:rPr>
-          <w:rFonts w:hint="eastAsia"/>
-          <w:lang w:eastAsia="zh-CN"/>
+          <w:lang w:val="en-US"/>
         </w:rPr>
-        <w:t xml:space="preserve"> </w:t>
-      </w:r>
-      <w:r>
-        <w:rPr>
-          <w:lang w:val="en-US" w:eastAsia="zh-CN"/>
-        </w:rPr>
-        <w:t>Pavement core holes will be patched following the fieldwork.</w:t>
+        <w:lastRenderedPageBreak/>
+        <w:t>Coring through existing pavement will be completed, where required, to facilitate access for geotechnical drilling.</w:t>
       </w:r>
     </w:p>
     <w:p>
@@ -328,7 +162,7 @@
         </w:numPr>
       </w:pPr>
       <w:r>
-        <w:t>Field examination of the site area and drilling/sampling of four (4) core holes, drilled to a minimum depth of 3.0 meters below existing grade, refusal, or to depths sufficient to establish subsurface conditions, whichever is the least. The location of the core holes will be determined based on access and utility considerations.</w:t>
+        <w:t>Field examination of the proposed building site area and drilling/sampling of five (5) boreholes, with four (4) boreholes drilled to a minimum depth of 6.0 meters and one (1) borehole drilled to a minimum depth of 9.0 meters below existing grade, refusal, or to depths sufficient to establish subsurface conditions, whichever is the least. The location of the boreholes will be determined based on access and utility considerations.</w:t>
       </w:r>
     </w:p>
     <w:p>
@@ -352,7 +186,7 @@
         </w:numPr>
       </w:pPr>
       <w:r>
-        <w:t>Perform in-situ soil consistency tests (i.e. SPT) in the subgrade, if soil conditions are favourable. Pocket penetrometer tests will be conducted in the field where possible.</w:t>
+        <w:t>Perform in-situ soil consistency tests (i.e. SPT) at 1.5m intervals, if soil conditions are favourable. Pocket penetrometer tests will be conducted in the field where possible.</w:t>
       </w:r>
     </w:p>
     <w:p>
@@ -400,7 +234,7 @@
         </w:numPr>
       </w:pPr>
       <w:r>
-        <w:t>Preparation of a summary engineering report which describes the work performed, presents our geotechnical site assessment findings.</w:t>
+        <w:t>Preparation of a summary engineering report which describes the work performed, presents the findings, and evaluates the geotechnical feasibility of constructing the proposed development.</w:t>
       </w:r>
     </w:p>
     <w:p>
@@ -408,11 +242,10 @@
         <w:pStyle w:val="Body"/>
       </w:pPr>
       <w:r>
-        <w:t xml:space="preserve">All work will be overseen by qualified and experienced Almor field staff who will log the soil and groundwater conditions encountered during the drilling program and collect suitable soil samples. </w:t>
+        <w:t>All work will be overseen by qualified and experienced Almor field staff who will log the soil and groundwater conditions encountered during the drilling program and collect suitable soil samples. Following the field work, the samples will be returned to our office for review, and submission to Almor’s laboratory for standard index testing. Almor understands the importance of environmental stewardship at the site locations and shall minimize the impact from drilling. We have assumed that all drill cuttings can be returned to the boreholes or scattered around the boreholes at surface</w:t>
       </w:r>
       <w:r>
-        <w:lastRenderedPageBreak/>
-        <w:t>Following the field work, the samples will be returned to our office for review, and submission to Almor’s laboratory for standard index testing. Almor understands the importance of environmental stewardship at the site locations and shall minimize the impact from drilling. We have assumed that all drill cuttings can be returned to the boreholes or scattered around the boreholes at surface.</w:t>
+        <w:t>.</w:t>
       </w:r>
     </w:p>
     <w:p>
@@ -422,8 +255,30 @@
     </w:p>
     <w:p>
       <w:pPr>
+        <w:pStyle w:val="Body"/>
+      </w:pPr>
+    </w:p>
+    <w:p>
+      <w:pPr>
+        <w:pStyle w:val="Body"/>
+      </w:pPr>
+    </w:p>
+    <w:p>
+      <w:pPr>
+        <w:pStyle w:val="Body"/>
+      </w:pPr>
+    </w:p>
+    <w:p>
+      <w:pPr>
+        <w:pStyle w:val="Body"/>
+        <w:rPr>
+          <w:lang w:val="en-US"/>
+        </w:rPr>
+      </w:pPr>
+    </w:p>
+    <w:p>
+      <w:pPr>
         <w:pStyle w:val="Heading3"/>
-        <w:pageBreakBefore/>
       </w:pPr>
       <w:r>
         <w:lastRenderedPageBreak/>
@@ -433,15 +288,13 @@
     <w:p>
       <w:pPr>
         <w:pStyle w:val="Body"/>
+        <w:rPr>
+          <w:lang w:eastAsia="zh-CN"/>
+        </w:rPr>
       </w:pPr>
       <w:r>
-        <w:t>Based on the information provided by the Client, Almor estimates the following costs to complete the proposed geotechnical services for the project.</w:t>
+        <w:t>Based on the information provided by the Client, Almor provides the following estimated cost to complete the proposed scope of work for the proposed multi-family residential development.</w:t>
       </w:r>
-    </w:p>
-    <w:p>
-      <w:pPr>
-        <w:pStyle w:val="Body"/>
-      </w:pPr>
     </w:p>
     <w:tbl>
       <w:tblPr>
@@ -450,11 +303,11 @@
         <w:tblLook w:val="04A0" w:firstRow="1" w:lastRow="0" w:firstColumn="1" w:lastColumn="0" w:noHBand="0" w:noVBand="1"/>
       </w:tblPr>
       <w:tblGrid>
-        <w:gridCol w:w="2950"/>
-        <w:gridCol w:w="3773"/>
+        <w:gridCol w:w="3114"/>
+        <w:gridCol w:w="3580"/>
         <w:gridCol w:w="528"/>
         <w:gridCol w:w="510"/>
-        <w:gridCol w:w="1283"/>
+        <w:gridCol w:w="1312"/>
         <w:gridCol w:w="928"/>
       </w:tblGrid>
       <w:tr>
@@ -813,7 +666,7 @@
                 <w:sz w:val="16"/>
                 <w:szCs w:val="16"/>
               </w:rPr>
-              <w:t>2</w:t>
+              <w:t>3</w:t>
             </w:r>
           </w:p>
         </w:tc>
@@ -861,7 +714,7 @@
                 <w:sz w:val="16"/>
                 <w:szCs w:val="16"/>
               </w:rPr>
-              <w:t>$370.00</w:t>
+              <w:t>$555.00</w:t>
             </w:r>
           </w:p>
         </w:tc>
@@ -986,7 +839,7 @@
                 <w:sz w:val="16"/>
                 <w:szCs w:val="16"/>
               </w:rPr>
-              <w:t>$370.00</w:t>
+              <w:t>$555.00</w:t>
             </w:r>
           </w:p>
         </w:tc>
@@ -1126,7 +979,7 @@
                 <w:sz w:val="16"/>
                 <w:szCs w:val="16"/>
               </w:rPr>
-              <w:t>Drilling Contractor</w:t>
+              <w:t>Coring</w:t>
             </w:r>
           </w:p>
         </w:tc>
@@ -1150,7 +1003,7 @@
                 <w:sz w:val="16"/>
                 <w:szCs w:val="16"/>
               </w:rPr>
-              <w:t>Mobilization/demobilization and on-site drilling</w:t>
+              <w:t>Coring contractor</w:t>
             </w:r>
           </w:p>
         </w:tc>
@@ -1174,7 +1027,7 @@
                 <w:sz w:val="16"/>
                 <w:szCs w:val="16"/>
               </w:rPr>
-              <w:t>hr</w:t>
+              <w:t>LS</w:t>
             </w:r>
           </w:p>
         </w:tc>
@@ -1198,7 +1051,7 @@
                 <w:sz w:val="16"/>
                 <w:szCs w:val="16"/>
               </w:rPr>
-              <w:t>6</w:t>
+              <w:t>1</w:t>
             </w:r>
           </w:p>
         </w:tc>
@@ -1222,7 +1075,7 @@
                 <w:sz w:val="16"/>
                 <w:szCs w:val="16"/>
               </w:rPr>
-              <w:t>$325.00</w:t>
+              <w:t>$500.00</w:t>
             </w:r>
           </w:p>
         </w:tc>
@@ -1246,7 +1099,7 @@
                 <w:sz w:val="16"/>
                 <w:szCs w:val="16"/>
               </w:rPr>
-              <w:t>$1,950.00</w:t>
+              <w:t>$500.00</w:t>
             </w:r>
           </w:p>
         </w:tc>
@@ -1272,7 +1125,7 @@
                 <w:sz w:val="16"/>
                 <w:szCs w:val="16"/>
               </w:rPr>
-              <w:t>Drilling Consumables</w:t>
+              <w:t>Drilling Contractor</w:t>
             </w:r>
           </w:p>
         </w:tc>
@@ -1296,7 +1149,7 @@
                 <w:sz w:val="16"/>
                 <w:szCs w:val="16"/>
               </w:rPr>
-              <w:t>PVC pipe, bentonite, etc.</w:t>
+              <w:t>Mobilization/demobilization and on-site drilling</w:t>
             </w:r>
           </w:p>
         </w:tc>
@@ -1320,7 +1173,7 @@
                 <w:sz w:val="16"/>
                 <w:szCs w:val="16"/>
               </w:rPr>
-              <w:t>LS</w:t>
+              <w:t>hr</w:t>
             </w:r>
           </w:p>
         </w:tc>
@@ -1344,7 +1197,7 @@
                 <w:sz w:val="16"/>
                 <w:szCs w:val="16"/>
               </w:rPr>
-              <w:t>1</w:t>
+              <w:t>8</w:t>
             </w:r>
           </w:p>
         </w:tc>
@@ -1368,7 +1221,7 @@
                 <w:sz w:val="16"/>
                 <w:szCs w:val="16"/>
               </w:rPr>
-              <w:t>$200.00</w:t>
+              <w:t>$325.00</w:t>
             </w:r>
           </w:p>
         </w:tc>
@@ -1392,7 +1245,7 @@
                 <w:sz w:val="16"/>
                 <w:szCs w:val="16"/>
               </w:rPr>
-              <w:t>$200.00</w:t>
+              <w:t>$2,600.00</w:t>
             </w:r>
           </w:p>
         </w:tc>
@@ -1421,7 +1274,7 @@
                 <w:sz w:val="16"/>
                 <w:szCs w:val="16"/>
               </w:rPr>
-              <w:t>Locate Contractor</w:t>
+              <w:t>Drilling Consumables</w:t>
             </w:r>
           </w:p>
         </w:tc>
@@ -1445,7 +1298,7 @@
                 <w:sz w:val="16"/>
                 <w:szCs w:val="16"/>
               </w:rPr>
-              <w:t>Secondary utility clearance</w:t>
+              <w:t>PVC pipe, bentonite, etc.</w:t>
             </w:r>
           </w:p>
         </w:tc>
@@ -1469,7 +1322,7 @@
                 <w:sz w:val="16"/>
                 <w:szCs w:val="16"/>
               </w:rPr>
-              <w:t>hr</w:t>
+              <w:t>LS</w:t>
             </w:r>
           </w:p>
         </w:tc>
@@ -1517,7 +1370,7 @@
                 <w:sz w:val="16"/>
                 <w:szCs w:val="16"/>
               </w:rPr>
-              <w:t>$225.00</w:t>
+              <w:t>$350.00</w:t>
             </w:r>
           </w:p>
         </w:tc>
@@ -1541,7 +1394,7 @@
                 <w:sz w:val="16"/>
                 <w:szCs w:val="16"/>
               </w:rPr>
-              <w:t>$225.00</w:t>
+              <w:t>$350.00</w:t>
             </w:r>
           </w:p>
         </w:tc>
@@ -1567,7 +1420,7 @@
                 <w:sz w:val="16"/>
                 <w:szCs w:val="16"/>
               </w:rPr>
-              <w:t>Engineering Field Personnel</w:t>
+              <w:t>Locate Contractor</w:t>
             </w:r>
           </w:p>
         </w:tc>
@@ -1591,7 +1444,7 @@
                 <w:sz w:val="16"/>
                 <w:szCs w:val="16"/>
               </w:rPr>
-              <w:t>Logging and sampling</w:t>
+              <w:t>Secondary utility clearance</w:t>
             </w:r>
           </w:p>
         </w:tc>
@@ -1639,7 +1492,7 @@
                 <w:sz w:val="16"/>
                 <w:szCs w:val="16"/>
               </w:rPr>
-              <w:t>6</w:t>
+              <w:t>2</w:t>
             </w:r>
           </w:p>
         </w:tc>
@@ -1663,7 +1516,7 @@
                 <w:sz w:val="16"/>
                 <w:szCs w:val="16"/>
               </w:rPr>
-              <w:t>$135.00</w:t>
+              <w:t>$225.00</w:t>
             </w:r>
           </w:p>
         </w:tc>
@@ -1687,7 +1540,7 @@
                 <w:sz w:val="16"/>
                 <w:szCs w:val="16"/>
               </w:rPr>
-              <w:t>$810.00</w:t>
+              <w:t>$450.00</w:t>
             </w:r>
           </w:p>
         </w:tc>
@@ -1716,7 +1569,7 @@
                 <w:sz w:val="16"/>
                 <w:szCs w:val="16"/>
               </w:rPr>
-              <w:t>Field Personnel</w:t>
+              <w:t>Engineering Field Personnel</w:t>
             </w:r>
           </w:p>
         </w:tc>
@@ -1740,7 +1593,7 @@
                 <w:sz w:val="16"/>
                 <w:szCs w:val="16"/>
               </w:rPr>
-              <w:t>Groundwater measurements and pavement core patching</w:t>
+              <w:t>Logging and sampling</w:t>
             </w:r>
           </w:p>
         </w:tc>
@@ -1788,7 +1641,7 @@
                 <w:sz w:val="16"/>
                 <w:szCs w:val="16"/>
               </w:rPr>
-              <w:t>3.5</w:t>
+              <w:t>8</w:t>
             </w:r>
           </w:p>
         </w:tc>
@@ -1812,7 +1665,7 @@
                 <w:sz w:val="16"/>
                 <w:szCs w:val="16"/>
               </w:rPr>
-              <w:t>$115.00</w:t>
+              <w:t>$135.00</w:t>
             </w:r>
           </w:p>
         </w:tc>
@@ -1836,7 +1689,7 @@
                 <w:sz w:val="16"/>
                 <w:szCs w:val="16"/>
               </w:rPr>
-              <w:t>$402.50</w:t>
+              <w:t>$1,080.00</w:t>
             </w:r>
           </w:p>
         </w:tc>
@@ -1857,6 +1710,13 @@
                 <w:szCs w:val="16"/>
               </w:rPr>
             </w:pPr>
+            <w:r>
+              <w:rPr>
+                <w:sz w:val="16"/>
+                <w:szCs w:val="16"/>
+              </w:rPr>
+              <w:t>Field Personnel</w:t>
+            </w:r>
           </w:p>
         </w:tc>
         <w:tc>
@@ -1874,6 +1734,13 @@
                 <w:szCs w:val="16"/>
               </w:rPr>
             </w:pPr>
+            <w:r>
+              <w:rPr>
+                <w:sz w:val="16"/>
+                <w:szCs w:val="16"/>
+              </w:rPr>
+              <w:t>Groundwater level measurements</w:t>
+            </w:r>
           </w:p>
         </w:tc>
         <w:tc>
@@ -1891,6 +1758,13 @@
                 <w:szCs w:val="16"/>
               </w:rPr>
             </w:pPr>
+            <w:r>
+              <w:rPr>
+                <w:sz w:val="16"/>
+                <w:szCs w:val="16"/>
+              </w:rPr>
+              <w:t>hr</w:t>
+            </w:r>
           </w:p>
         </w:tc>
         <w:tc>
@@ -1908,6 +1782,13 @@
                 <w:szCs w:val="16"/>
               </w:rPr>
             </w:pPr>
+            <w:r>
+              <w:rPr>
+                <w:sz w:val="16"/>
+                <w:szCs w:val="16"/>
+              </w:rPr>
+              <w:t>1.5</w:t>
+            </w:r>
           </w:p>
         </w:tc>
         <w:tc>
@@ -1927,12 +1808,10 @@
             </w:pPr>
             <w:r>
               <w:rPr>
-                <w:b/>
-                <w:bCs/>
-                <w:sz w:val="16"/>
-                <w:szCs w:val="16"/>
-              </w:rPr>
-              <w:t>Subtotal</w:t>
+                <w:sz w:val="16"/>
+                <w:szCs w:val="16"/>
+              </w:rPr>
+              <w:t>$115.00</w:t>
             </w:r>
           </w:p>
         </w:tc>
@@ -1953,12 +1832,10 @@
             </w:pPr>
             <w:r>
               <w:rPr>
-                <w:b/>
-                <w:bCs/>
-                <w:sz w:val="16"/>
-                <w:szCs w:val="16"/>
-              </w:rPr>
-              <w:t>$3,587.50</w:t>
+                <w:sz w:val="16"/>
+                <w:szCs w:val="16"/>
+              </w:rPr>
+              <w:t>$172.50</w:t>
             </w:r>
           </w:p>
         </w:tc>
@@ -1982,13 +1859,6 @@
                 <w:szCs w:val="16"/>
               </w:rPr>
             </w:pPr>
-            <w:r>
-              <w:rPr>
-                <w:sz w:val="16"/>
-                <w:szCs w:val="16"/>
-              </w:rPr>
-              <w:t>Laboratory Testing Program</w:t>
-            </w:r>
           </w:p>
         </w:tc>
         <w:tc>
@@ -2057,6 +1927,15 @@
                 <w:szCs w:val="16"/>
               </w:rPr>
             </w:pPr>
+            <w:r>
+              <w:rPr>
+                <w:b/>
+                <w:bCs/>
+                <w:sz w:val="16"/>
+                <w:szCs w:val="16"/>
+              </w:rPr>
+              <w:t>Subtotal</w:t>
+            </w:r>
           </w:p>
         </w:tc>
         <w:tc>
@@ -2074,6 +1953,15 @@
                 <w:szCs w:val="16"/>
               </w:rPr>
             </w:pPr>
+            <w:r>
+              <w:rPr>
+                <w:b/>
+                <w:bCs/>
+                <w:sz w:val="16"/>
+                <w:szCs w:val="16"/>
+              </w:rPr>
+              <w:t>$5,152.50</w:t>
+            </w:r>
           </w:p>
         </w:tc>
       </w:tr>
@@ -2098,7 +1986,7 @@
                 <w:sz w:val="16"/>
                 <w:szCs w:val="16"/>
               </w:rPr>
-              <w:t>Moisture Content Tests</w:t>
+              <w:t>Laboratory Testing Program</w:t>
             </w:r>
           </w:p>
         </w:tc>
@@ -2117,13 +2005,6 @@
                 <w:szCs w:val="16"/>
               </w:rPr>
             </w:pPr>
-            <w:r>
-              <w:rPr>
-                <w:sz w:val="16"/>
-                <w:szCs w:val="16"/>
-              </w:rPr>
-              <w:t>ASTM D2216</w:t>
-            </w:r>
           </w:p>
         </w:tc>
         <w:tc>
@@ -2141,15 +2022,6 @@
                 <w:szCs w:val="16"/>
               </w:rPr>
             </w:pPr>
-            <w:proofErr w:type="spellStart"/>
-            <w:r>
-              <w:rPr>
-                <w:sz w:val="16"/>
-                <w:szCs w:val="16"/>
-              </w:rPr>
-              <w:t>Ea</w:t>
-            </w:r>
-            <w:proofErr w:type="spellEnd"/>
           </w:p>
         </w:tc>
         <w:tc>
@@ -2167,13 +2039,6 @@
                 <w:szCs w:val="16"/>
               </w:rPr>
             </w:pPr>
-            <w:r>
-              <w:rPr>
-                <w:sz w:val="16"/>
-                <w:szCs w:val="16"/>
-              </w:rPr>
-              <w:t>16</w:t>
-            </w:r>
           </w:p>
         </w:tc>
         <w:tc>
@@ -2191,13 +2056,6 @@
                 <w:szCs w:val="16"/>
               </w:rPr>
             </w:pPr>
-            <w:r>
-              <w:rPr>
-                <w:sz w:val="16"/>
-                <w:szCs w:val="16"/>
-              </w:rPr>
-              <w:t>$8.25</w:t>
-            </w:r>
           </w:p>
         </w:tc>
         <w:tc>
@@ -2215,13 +2073,6 @@
                 <w:szCs w:val="16"/>
               </w:rPr>
             </w:pPr>
-            <w:r>
-              <w:rPr>
-                <w:sz w:val="16"/>
-                <w:szCs w:val="16"/>
-              </w:rPr>
-              <w:t>$132.00</w:t>
-            </w:r>
           </w:p>
         </w:tc>
       </w:tr>
@@ -2249,7 +2100,7 @@
                 <w:sz w:val="16"/>
                 <w:szCs w:val="16"/>
               </w:rPr>
-              <w:t>Standard Proctor</w:t>
+              <w:t>Moisture Content Tests</w:t>
             </w:r>
           </w:p>
         </w:tc>
@@ -2273,7 +2124,7 @@
                 <w:sz w:val="16"/>
                 <w:szCs w:val="16"/>
               </w:rPr>
-              <w:t>ASTM D698</w:t>
+              <w:t>ASTM D2216</w:t>
             </w:r>
           </w:p>
         </w:tc>
@@ -2292,7 +2143,6 @@
                 <w:szCs w:val="16"/>
               </w:rPr>
             </w:pPr>
-            <w:proofErr w:type="spellStart"/>
             <w:r>
               <w:rPr>
                 <w:sz w:val="16"/>
@@ -2300,7 +2150,6 @@
               </w:rPr>
               <w:t>Ea</w:t>
             </w:r>
-            <w:proofErr w:type="spellEnd"/>
           </w:p>
         </w:tc>
         <w:tc>
@@ -2323,7 +2172,7 @@
                 <w:sz w:val="16"/>
                 <w:szCs w:val="16"/>
               </w:rPr>
-              <w:t>1</w:t>
+              <w:t>42</w:t>
             </w:r>
           </w:p>
         </w:tc>
@@ -2347,7 +2196,7 @@
                 <w:sz w:val="16"/>
                 <w:szCs w:val="16"/>
               </w:rPr>
-              <w:t>$265.00</w:t>
+              <w:t>$8.25</w:t>
             </w:r>
           </w:p>
         </w:tc>
@@ -2371,7 +2220,7 @@
                 <w:sz w:val="16"/>
                 <w:szCs w:val="16"/>
               </w:rPr>
-              <w:t>$265.00</w:t>
+              <w:t>$346.50</w:t>
             </w:r>
           </w:p>
         </w:tc>
@@ -2397,7 +2246,7 @@
                 <w:sz w:val="16"/>
                 <w:szCs w:val="16"/>
               </w:rPr>
-              <w:t>California Bearing Ratio Test</w:t>
+              <w:t>Atterberg Limits</w:t>
             </w:r>
           </w:p>
         </w:tc>
@@ -2421,7 +2270,7 @@
                 <w:sz w:val="16"/>
                 <w:szCs w:val="16"/>
               </w:rPr>
-              <w:t>CBR</w:t>
+              <w:t>ASTM D4318</w:t>
             </w:r>
           </w:p>
         </w:tc>
@@ -2440,7 +2289,6 @@
                 <w:szCs w:val="16"/>
               </w:rPr>
             </w:pPr>
-            <w:proofErr w:type="spellStart"/>
             <w:r>
               <w:rPr>
                 <w:sz w:val="16"/>
@@ -2448,7 +2296,6 @@
               </w:rPr>
               <w:t>Ea</w:t>
             </w:r>
-            <w:proofErr w:type="spellEnd"/>
           </w:p>
         </w:tc>
         <w:tc>
@@ -2471,7 +2318,7 @@
                 <w:sz w:val="16"/>
                 <w:szCs w:val="16"/>
               </w:rPr>
-              <w:t>1</w:t>
+              <w:t>2</w:t>
             </w:r>
           </w:p>
         </w:tc>
@@ -2495,7 +2342,7 @@
                 <w:sz w:val="16"/>
                 <w:szCs w:val="16"/>
               </w:rPr>
-              <w:t>$300.00</w:t>
+              <w:t>$225.00</w:t>
             </w:r>
           </w:p>
         </w:tc>
@@ -2519,7 +2366,7 @@
                 <w:sz w:val="16"/>
                 <w:szCs w:val="16"/>
               </w:rPr>
-              <w:t>$300.00</w:t>
+              <w:t>$450.00</w:t>
             </w:r>
           </w:p>
         </w:tc>
@@ -2543,6 +2390,13 @@
                 <w:szCs w:val="16"/>
               </w:rPr>
             </w:pPr>
+            <w:r>
+              <w:rPr>
+                <w:sz w:val="16"/>
+                <w:szCs w:val="16"/>
+              </w:rPr>
+              <w:t xml:space="preserve">Hydrometer Analysis </w:t>
+            </w:r>
           </w:p>
         </w:tc>
         <w:tc>
@@ -2560,6 +2414,13 @@
                 <w:szCs w:val="16"/>
               </w:rPr>
             </w:pPr>
+            <w:r>
+              <w:rPr>
+                <w:sz w:val="16"/>
+                <w:szCs w:val="16"/>
+              </w:rPr>
+              <w:t>ASTM D7928</w:t>
+            </w:r>
           </w:p>
         </w:tc>
         <w:tc>
@@ -2577,6 +2438,13 @@
                 <w:szCs w:val="16"/>
               </w:rPr>
             </w:pPr>
+            <w:r>
+              <w:rPr>
+                <w:sz w:val="16"/>
+                <w:szCs w:val="16"/>
+              </w:rPr>
+              <w:t>Ea</w:t>
+            </w:r>
           </w:p>
         </w:tc>
         <w:tc>
@@ -2594,6 +2462,13 @@
                 <w:szCs w:val="16"/>
               </w:rPr>
             </w:pPr>
+            <w:r>
+              <w:rPr>
+                <w:sz w:val="16"/>
+                <w:szCs w:val="16"/>
+              </w:rPr>
+              <w:t>1</w:t>
+            </w:r>
           </w:p>
         </w:tc>
         <w:tc>
@@ -2613,12 +2488,10 @@
             </w:pPr>
             <w:r>
               <w:rPr>
-                <w:b/>
-                <w:bCs/>
-                <w:sz w:val="16"/>
-                <w:szCs w:val="16"/>
-              </w:rPr>
-              <w:t>Subtotal</w:t>
+                <w:sz w:val="16"/>
+                <w:szCs w:val="16"/>
+              </w:rPr>
+              <w:t>$275.00</w:t>
             </w:r>
           </w:p>
         </w:tc>
@@ -2639,12 +2512,10 @@
             </w:pPr>
             <w:r>
               <w:rPr>
-                <w:b/>
-                <w:bCs/>
-                <w:sz w:val="16"/>
-                <w:szCs w:val="16"/>
-              </w:rPr>
-              <w:t>$697.00</w:t>
+                <w:sz w:val="16"/>
+                <w:szCs w:val="16"/>
+              </w:rPr>
+              <w:t>$275.00</w:t>
             </w:r>
           </w:p>
         </w:tc>
@@ -2670,7 +2541,7 @@
                 <w:sz w:val="16"/>
                 <w:szCs w:val="16"/>
               </w:rPr>
-              <w:t>Engineering Analysis &amp; Report Preparation</w:t>
+              <w:t>Organic Content Tests</w:t>
             </w:r>
           </w:p>
         </w:tc>
@@ -2706,6 +2577,13 @@
                 <w:szCs w:val="16"/>
               </w:rPr>
             </w:pPr>
+            <w:r>
+              <w:rPr>
+                <w:sz w:val="16"/>
+                <w:szCs w:val="16"/>
+              </w:rPr>
+              <w:t>Ea</w:t>
+            </w:r>
           </w:p>
         </w:tc>
         <w:tc>
@@ -2723,6 +2601,13 @@
                 <w:szCs w:val="16"/>
               </w:rPr>
             </w:pPr>
+            <w:r>
+              <w:rPr>
+                <w:sz w:val="16"/>
+                <w:szCs w:val="16"/>
+              </w:rPr>
+              <w:t>2</w:t>
+            </w:r>
           </w:p>
         </w:tc>
         <w:tc>
@@ -2740,6 +2625,13 @@
                 <w:szCs w:val="16"/>
               </w:rPr>
             </w:pPr>
+            <w:r>
+              <w:rPr>
+                <w:sz w:val="16"/>
+                <w:szCs w:val="16"/>
+              </w:rPr>
+              <w:t>$70.00</w:t>
+            </w:r>
           </w:p>
         </w:tc>
         <w:tc>
@@ -2757,6 +2649,13 @@
                 <w:szCs w:val="16"/>
               </w:rPr>
             </w:pPr>
+            <w:r>
+              <w:rPr>
+                <w:sz w:val="16"/>
+                <w:szCs w:val="16"/>
+              </w:rPr>
+              <w:t>$140.00</w:t>
+            </w:r>
           </w:p>
         </w:tc>
       </w:tr>
@@ -2784,7 +2683,7 @@
                 <w:sz w:val="16"/>
                 <w:szCs w:val="16"/>
               </w:rPr>
-              <w:t>Junior Professional</w:t>
+              <w:t>Sulphate Content Tests</w:t>
             </w:r>
           </w:p>
         </w:tc>
@@ -2825,7 +2724,7 @@
                 <w:sz w:val="16"/>
                 <w:szCs w:val="16"/>
               </w:rPr>
-              <w:t>hr</w:t>
+              <w:t>Ea</w:t>
             </w:r>
           </w:p>
         </w:tc>
@@ -2849,7 +2748,7 @@
                 <w:sz w:val="16"/>
                 <w:szCs w:val="16"/>
               </w:rPr>
-              <w:t>8</w:t>
+              <w:t>5</w:t>
             </w:r>
           </w:p>
         </w:tc>
@@ -2873,7 +2772,7 @@
                 <w:sz w:val="16"/>
                 <w:szCs w:val="16"/>
               </w:rPr>
-              <w:t>$135.00</w:t>
+              <w:t>$65.00</w:t>
             </w:r>
           </w:p>
         </w:tc>
@@ -2897,7 +2796,7 @@
                 <w:sz w:val="16"/>
                 <w:szCs w:val="16"/>
               </w:rPr>
-              <w:t>$1,080.00</w:t>
+              <w:t>$325.00</w:t>
             </w:r>
           </w:p>
         </w:tc>
@@ -2918,13 +2817,6 @@
                 <w:szCs w:val="16"/>
               </w:rPr>
             </w:pPr>
-            <w:r>
-              <w:rPr>
-                <w:sz w:val="16"/>
-                <w:szCs w:val="16"/>
-              </w:rPr>
-              <w:t>Intermediate Professional</w:t>
-            </w:r>
           </w:p>
         </w:tc>
         <w:tc>
@@ -2959,13 +2851,6 @@
                 <w:szCs w:val="16"/>
               </w:rPr>
             </w:pPr>
-            <w:r>
-              <w:rPr>
-                <w:sz w:val="16"/>
-                <w:szCs w:val="16"/>
-              </w:rPr>
-              <w:t>hr</w:t>
-            </w:r>
           </w:p>
         </w:tc>
         <w:tc>
@@ -2983,13 +2868,6 @@
                 <w:szCs w:val="16"/>
               </w:rPr>
             </w:pPr>
-            <w:r>
-              <w:rPr>
-                <w:sz w:val="16"/>
-                <w:szCs w:val="16"/>
-              </w:rPr>
-              <w:t>1</w:t>
-            </w:r>
           </w:p>
         </w:tc>
         <w:tc>
@@ -3009,10 +2887,12 @@
             </w:pPr>
             <w:r>
               <w:rPr>
-                <w:sz w:val="16"/>
-                <w:szCs w:val="16"/>
-              </w:rPr>
-              <w:t>$185.00</w:t>
+                <w:b/>
+                <w:bCs/>
+                <w:sz w:val="16"/>
+                <w:szCs w:val="16"/>
+              </w:rPr>
+              <w:t>Subtotal</w:t>
             </w:r>
           </w:p>
         </w:tc>
@@ -3033,10 +2913,12 @@
             </w:pPr>
             <w:r>
               <w:rPr>
-                <w:sz w:val="16"/>
-                <w:szCs w:val="16"/>
-              </w:rPr>
-              <w:t>$185.00</w:t>
+                <w:b/>
+                <w:bCs/>
+                <w:sz w:val="16"/>
+                <w:szCs w:val="16"/>
+              </w:rPr>
+              <w:t>$1,536.50</w:t>
             </w:r>
           </w:p>
         </w:tc>
@@ -3065,7 +2947,7 @@
                 <w:sz w:val="16"/>
                 <w:szCs w:val="16"/>
               </w:rPr>
-              <w:t>Senior Professional</w:t>
+              <w:t>Engineering Analysis &amp; Report Preparation</w:t>
             </w:r>
           </w:p>
         </w:tc>
@@ -3101,13 +2983,6 @@
                 <w:szCs w:val="16"/>
               </w:rPr>
             </w:pPr>
-            <w:r>
-              <w:rPr>
-                <w:sz w:val="16"/>
-                <w:szCs w:val="16"/>
-              </w:rPr>
-              <w:t>hr</w:t>
-            </w:r>
           </w:p>
         </w:tc>
         <w:tc>
@@ -3125,13 +3000,6 @@
                 <w:szCs w:val="16"/>
               </w:rPr>
             </w:pPr>
-            <w:r>
-              <w:rPr>
-                <w:sz w:val="16"/>
-                <w:szCs w:val="16"/>
-              </w:rPr>
-              <w:t>1</w:t>
-            </w:r>
           </w:p>
         </w:tc>
         <w:tc>
@@ -3149,13 +3017,6 @@
                 <w:szCs w:val="16"/>
               </w:rPr>
             </w:pPr>
-            <w:r>
-              <w:rPr>
-                <w:sz w:val="16"/>
-                <w:szCs w:val="16"/>
-              </w:rPr>
-              <w:t>$250.00</w:t>
-            </w:r>
           </w:p>
         </w:tc>
         <w:tc>
@@ -3173,13 +3034,6 @@
                 <w:szCs w:val="16"/>
               </w:rPr>
             </w:pPr>
-            <w:r>
-              <w:rPr>
-                <w:sz w:val="16"/>
-                <w:szCs w:val="16"/>
-              </w:rPr>
-              <w:t>$250.00</w:t>
-            </w:r>
           </w:p>
         </w:tc>
       </w:tr>
@@ -3199,6 +3053,13 @@
                 <w:szCs w:val="16"/>
               </w:rPr>
             </w:pPr>
+            <w:r>
+              <w:rPr>
+                <w:sz w:val="16"/>
+                <w:szCs w:val="16"/>
+              </w:rPr>
+              <w:t>Junior Professional</w:t>
+            </w:r>
           </w:p>
         </w:tc>
         <w:tc>
@@ -3233,6 +3094,13 @@
                 <w:szCs w:val="16"/>
               </w:rPr>
             </w:pPr>
+            <w:r>
+              <w:rPr>
+                <w:sz w:val="16"/>
+                <w:szCs w:val="16"/>
+              </w:rPr>
+              <w:t>hr</w:t>
+            </w:r>
           </w:p>
         </w:tc>
         <w:tc>
@@ -3250,6 +3118,13 @@
                 <w:szCs w:val="16"/>
               </w:rPr>
             </w:pPr>
+            <w:r>
+              <w:rPr>
+                <w:sz w:val="16"/>
+                <w:szCs w:val="16"/>
+              </w:rPr>
+              <w:t>12</w:t>
+            </w:r>
           </w:p>
         </w:tc>
         <w:tc>
@@ -3269,12 +3144,10 @@
             </w:pPr>
             <w:r>
               <w:rPr>
-                <w:b/>
-                <w:bCs/>
-                <w:sz w:val="16"/>
-                <w:szCs w:val="16"/>
-              </w:rPr>
-              <w:t>Subtotal</w:t>
+                <w:sz w:val="16"/>
+                <w:szCs w:val="16"/>
+              </w:rPr>
+              <w:t>$135.00</w:t>
             </w:r>
           </w:p>
         </w:tc>
@@ -3295,12 +3168,10 @@
             </w:pPr>
             <w:r>
               <w:rPr>
-                <w:b/>
-                <w:bCs/>
-                <w:sz w:val="16"/>
-                <w:szCs w:val="16"/>
-              </w:rPr>
-              <w:t>$1,515.00</w:t>
+                <w:sz w:val="16"/>
+                <w:szCs w:val="16"/>
+              </w:rPr>
+              <w:t>$1,620.00</w:t>
             </w:r>
           </w:p>
         </w:tc>
@@ -3324,6 +3195,287 @@
                 <w:szCs w:val="16"/>
               </w:rPr>
             </w:pPr>
+            <w:r>
+              <w:rPr>
+                <w:sz w:val="16"/>
+                <w:szCs w:val="16"/>
+              </w:rPr>
+              <w:t>Intermediate Professional</w:t>
+            </w:r>
+          </w:p>
+        </w:tc>
+        <w:tc>
+          <w:tcPr>
+            <w:tcW w:w="0" w:type="auto"/>
+            <w:hideMark/>
+          </w:tcPr>
+          <w:p>
+            <w:pPr>
+              <w:pStyle w:val="Body"/>
+              <w:spacing w:after="160" w:line="259" w:lineRule="auto"/>
+              <w:cnfStyle w:val="000000100000" w:firstRow="0" w:lastRow="0" w:firstColumn="0" w:lastColumn="0" w:oddVBand="0" w:evenVBand="0" w:oddHBand="1" w:evenHBand="0" w:firstRowFirstColumn="0" w:firstRowLastColumn="0" w:lastRowFirstColumn="0" w:lastRowLastColumn="0"/>
+              <w:rPr>
+                <w:sz w:val="16"/>
+                <w:szCs w:val="16"/>
+              </w:rPr>
+            </w:pPr>
+          </w:p>
+        </w:tc>
+        <w:tc>
+          <w:tcPr>
+            <w:tcW w:w="0" w:type="auto"/>
+            <w:hideMark/>
+          </w:tcPr>
+          <w:p>
+            <w:pPr>
+              <w:pStyle w:val="Body"/>
+              <w:spacing w:after="160" w:line="259" w:lineRule="auto"/>
+              <w:cnfStyle w:val="000000100000" w:firstRow="0" w:lastRow="0" w:firstColumn="0" w:lastColumn="0" w:oddVBand="0" w:evenVBand="0" w:oddHBand="1" w:evenHBand="0" w:firstRowFirstColumn="0" w:firstRowLastColumn="0" w:lastRowFirstColumn="0" w:lastRowLastColumn="0"/>
+              <w:rPr>
+                <w:sz w:val="16"/>
+                <w:szCs w:val="16"/>
+              </w:rPr>
+            </w:pPr>
+            <w:r>
+              <w:rPr>
+                <w:sz w:val="16"/>
+                <w:szCs w:val="16"/>
+              </w:rPr>
+              <w:t>hr</w:t>
+            </w:r>
+          </w:p>
+        </w:tc>
+        <w:tc>
+          <w:tcPr>
+            <w:tcW w:w="0" w:type="auto"/>
+            <w:hideMark/>
+          </w:tcPr>
+          <w:p>
+            <w:pPr>
+              <w:pStyle w:val="Body"/>
+              <w:spacing w:after="160" w:line="259" w:lineRule="auto"/>
+              <w:cnfStyle w:val="000000100000" w:firstRow="0" w:lastRow="0" w:firstColumn="0" w:lastColumn="0" w:oddVBand="0" w:evenVBand="0" w:oddHBand="1" w:evenHBand="0" w:firstRowFirstColumn="0" w:firstRowLastColumn="0" w:lastRowFirstColumn="0" w:lastRowLastColumn="0"/>
+              <w:rPr>
+                <w:sz w:val="16"/>
+                <w:szCs w:val="16"/>
+              </w:rPr>
+            </w:pPr>
+            <w:r>
+              <w:rPr>
+                <w:sz w:val="16"/>
+                <w:szCs w:val="16"/>
+              </w:rPr>
+              <w:t>2</w:t>
+            </w:r>
+          </w:p>
+        </w:tc>
+        <w:tc>
+          <w:tcPr>
+            <w:tcW w:w="0" w:type="auto"/>
+            <w:hideMark/>
+          </w:tcPr>
+          <w:p>
+            <w:pPr>
+              <w:pStyle w:val="Body"/>
+              <w:spacing w:after="160" w:line="259" w:lineRule="auto"/>
+              <w:cnfStyle w:val="000000100000" w:firstRow="0" w:lastRow="0" w:firstColumn="0" w:lastColumn="0" w:oddVBand="0" w:evenVBand="0" w:oddHBand="1" w:evenHBand="0" w:firstRowFirstColumn="0" w:firstRowLastColumn="0" w:lastRowFirstColumn="0" w:lastRowLastColumn="0"/>
+              <w:rPr>
+                <w:sz w:val="16"/>
+                <w:szCs w:val="16"/>
+              </w:rPr>
+            </w:pPr>
+            <w:r>
+              <w:rPr>
+                <w:sz w:val="16"/>
+                <w:szCs w:val="16"/>
+              </w:rPr>
+              <w:t>$185.00</w:t>
+            </w:r>
+          </w:p>
+        </w:tc>
+        <w:tc>
+          <w:tcPr>
+            <w:tcW w:w="0" w:type="auto"/>
+            <w:hideMark/>
+          </w:tcPr>
+          <w:p>
+            <w:pPr>
+              <w:pStyle w:val="Body"/>
+              <w:spacing w:after="160" w:line="259" w:lineRule="auto"/>
+              <w:cnfStyle w:val="000000100000" w:firstRow="0" w:lastRow="0" w:firstColumn="0" w:lastColumn="0" w:oddVBand="0" w:evenVBand="0" w:oddHBand="1" w:evenHBand="0" w:firstRowFirstColumn="0" w:firstRowLastColumn="0" w:lastRowFirstColumn="0" w:lastRowLastColumn="0"/>
+              <w:rPr>
+                <w:sz w:val="16"/>
+                <w:szCs w:val="16"/>
+              </w:rPr>
+            </w:pPr>
+            <w:r>
+              <w:rPr>
+                <w:sz w:val="16"/>
+                <w:szCs w:val="16"/>
+              </w:rPr>
+              <w:t>$370.00</w:t>
+            </w:r>
+          </w:p>
+        </w:tc>
+      </w:tr>
+      <w:tr>
+        <w:tc>
+          <w:tcPr>
+            <w:cnfStyle w:val="001000000000" w:firstRow="0" w:lastRow="0" w:firstColumn="1" w:lastColumn="0" w:oddVBand="0" w:evenVBand="0" w:oddHBand="0" w:evenHBand="0" w:firstRowFirstColumn="0" w:firstRowLastColumn="0" w:lastRowFirstColumn="0" w:lastRowLastColumn="0"/>
+            <w:tcW w:w="0" w:type="auto"/>
+            <w:hideMark/>
+          </w:tcPr>
+          <w:p>
+            <w:pPr>
+              <w:pStyle w:val="Body"/>
+              <w:spacing w:after="160" w:line="259" w:lineRule="auto"/>
+              <w:rPr>
+                <w:sz w:val="16"/>
+                <w:szCs w:val="16"/>
+              </w:rPr>
+            </w:pPr>
+            <w:r>
+              <w:rPr>
+                <w:sz w:val="16"/>
+                <w:szCs w:val="16"/>
+              </w:rPr>
+              <w:t>Senior Professional</w:t>
+            </w:r>
+          </w:p>
+        </w:tc>
+        <w:tc>
+          <w:tcPr>
+            <w:tcW w:w="0" w:type="auto"/>
+            <w:hideMark/>
+          </w:tcPr>
+          <w:p>
+            <w:pPr>
+              <w:pStyle w:val="Body"/>
+              <w:spacing w:after="160" w:line="259" w:lineRule="auto"/>
+              <w:cnfStyle w:val="000000000000" w:firstRow="0" w:lastRow="0" w:firstColumn="0" w:lastColumn="0" w:oddVBand="0" w:evenVBand="0" w:oddHBand="0" w:evenHBand="0" w:firstRowFirstColumn="0" w:firstRowLastColumn="0" w:lastRowFirstColumn="0" w:lastRowLastColumn="0"/>
+              <w:rPr>
+                <w:sz w:val="16"/>
+                <w:szCs w:val="16"/>
+              </w:rPr>
+            </w:pPr>
+          </w:p>
+        </w:tc>
+        <w:tc>
+          <w:tcPr>
+            <w:tcW w:w="0" w:type="auto"/>
+            <w:hideMark/>
+          </w:tcPr>
+          <w:p>
+            <w:pPr>
+              <w:pStyle w:val="Body"/>
+              <w:spacing w:after="160" w:line="259" w:lineRule="auto"/>
+              <w:cnfStyle w:val="000000000000" w:firstRow="0" w:lastRow="0" w:firstColumn="0" w:lastColumn="0" w:oddVBand="0" w:evenVBand="0" w:oddHBand="0" w:evenHBand="0" w:firstRowFirstColumn="0" w:firstRowLastColumn="0" w:lastRowFirstColumn="0" w:lastRowLastColumn="0"/>
+              <w:rPr>
+                <w:sz w:val="16"/>
+                <w:szCs w:val="16"/>
+              </w:rPr>
+            </w:pPr>
+            <w:r>
+              <w:rPr>
+                <w:sz w:val="16"/>
+                <w:szCs w:val="16"/>
+              </w:rPr>
+              <w:t>hr</w:t>
+            </w:r>
+          </w:p>
+        </w:tc>
+        <w:tc>
+          <w:tcPr>
+            <w:tcW w:w="0" w:type="auto"/>
+            <w:hideMark/>
+          </w:tcPr>
+          <w:p>
+            <w:pPr>
+              <w:pStyle w:val="Body"/>
+              <w:spacing w:after="160" w:line="259" w:lineRule="auto"/>
+              <w:cnfStyle w:val="000000000000" w:firstRow="0" w:lastRow="0" w:firstColumn="0" w:lastColumn="0" w:oddVBand="0" w:evenVBand="0" w:oddHBand="0" w:evenHBand="0" w:firstRowFirstColumn="0" w:firstRowLastColumn="0" w:lastRowFirstColumn="0" w:lastRowLastColumn="0"/>
+              <w:rPr>
+                <w:sz w:val="16"/>
+                <w:szCs w:val="16"/>
+              </w:rPr>
+            </w:pPr>
+            <w:r>
+              <w:rPr>
+                <w:sz w:val="16"/>
+                <w:szCs w:val="16"/>
+              </w:rPr>
+              <w:t>2</w:t>
+            </w:r>
+          </w:p>
+        </w:tc>
+        <w:tc>
+          <w:tcPr>
+            <w:tcW w:w="0" w:type="auto"/>
+            <w:hideMark/>
+          </w:tcPr>
+          <w:p>
+            <w:pPr>
+              <w:pStyle w:val="Body"/>
+              <w:spacing w:after="160" w:line="259" w:lineRule="auto"/>
+              <w:cnfStyle w:val="000000000000" w:firstRow="0" w:lastRow="0" w:firstColumn="0" w:lastColumn="0" w:oddVBand="0" w:evenVBand="0" w:oddHBand="0" w:evenHBand="0" w:firstRowFirstColumn="0" w:firstRowLastColumn="0" w:lastRowFirstColumn="0" w:lastRowLastColumn="0"/>
+              <w:rPr>
+                <w:sz w:val="16"/>
+                <w:szCs w:val="16"/>
+              </w:rPr>
+            </w:pPr>
+            <w:r>
+              <w:rPr>
+                <w:sz w:val="16"/>
+                <w:szCs w:val="16"/>
+              </w:rPr>
+              <w:t>$250.00</w:t>
+            </w:r>
+          </w:p>
+        </w:tc>
+        <w:tc>
+          <w:tcPr>
+            <w:tcW w:w="0" w:type="auto"/>
+            <w:hideMark/>
+          </w:tcPr>
+          <w:p>
+            <w:pPr>
+              <w:pStyle w:val="Body"/>
+              <w:spacing w:after="160" w:line="259" w:lineRule="auto"/>
+              <w:cnfStyle w:val="000000000000" w:firstRow="0" w:lastRow="0" w:firstColumn="0" w:lastColumn="0" w:oddVBand="0" w:evenVBand="0" w:oddHBand="0" w:evenHBand="0" w:firstRowFirstColumn="0" w:firstRowLastColumn="0" w:lastRowFirstColumn="0" w:lastRowLastColumn="0"/>
+              <w:rPr>
+                <w:sz w:val="16"/>
+                <w:szCs w:val="16"/>
+              </w:rPr>
+            </w:pPr>
+            <w:r>
+              <w:rPr>
+                <w:sz w:val="16"/>
+                <w:szCs w:val="16"/>
+              </w:rPr>
+              <w:t>$500.00</w:t>
+            </w:r>
+          </w:p>
+        </w:tc>
+      </w:tr>
+      <w:tr>
+        <w:trPr>
+          <w:cnfStyle w:val="000000100000" w:firstRow="0" w:lastRow="0" w:firstColumn="0" w:lastColumn="0" w:oddVBand="0" w:evenVBand="0" w:oddHBand="1" w:evenHBand="0" w:firstRowFirstColumn="0" w:firstRowLastColumn="0" w:lastRowFirstColumn="0" w:lastRowLastColumn="0"/>
+        </w:trPr>
+        <w:tc>
+          <w:tcPr>
+            <w:cnfStyle w:val="001000000000" w:firstRow="0" w:lastRow="0" w:firstColumn="1" w:lastColumn="0" w:oddVBand="0" w:evenVBand="0" w:oddHBand="0" w:evenHBand="0" w:firstRowFirstColumn="0" w:firstRowLastColumn="0" w:lastRowFirstColumn="0" w:lastRowLastColumn="0"/>
+            <w:tcW w:w="0" w:type="auto"/>
+            <w:hideMark/>
+          </w:tcPr>
+          <w:p>
+            <w:pPr>
+              <w:pStyle w:val="Body"/>
+              <w:spacing w:after="160" w:line="259" w:lineRule="auto"/>
+              <w:rPr>
+                <w:sz w:val="16"/>
+                <w:szCs w:val="16"/>
+              </w:rPr>
+            </w:pPr>
           </w:p>
         </w:tc>
         <w:tc>
@@ -3399,7 +3551,7 @@
                 <w:sz w:val="16"/>
                 <w:szCs w:val="16"/>
               </w:rPr>
-              <w:t>Estimated Cost</w:t>
+              <w:t>Subtotal</w:t>
             </w:r>
           </w:p>
         </w:tc>
@@ -3425,7 +3577,129 @@
                 <w:sz w:val="16"/>
                 <w:szCs w:val="16"/>
               </w:rPr>
-              <w:t>$6,169.50</w:t>
+              <w:t>$2,490.00</w:t>
+            </w:r>
+          </w:p>
+        </w:tc>
+      </w:tr>
+      <w:tr>
+        <w:tc>
+          <w:tcPr>
+            <w:cnfStyle w:val="001000000000" w:firstRow="0" w:lastRow="0" w:firstColumn="1" w:lastColumn="0" w:oddVBand="0" w:evenVBand="0" w:oddHBand="0" w:evenHBand="0" w:firstRowFirstColumn="0" w:firstRowLastColumn="0" w:lastRowFirstColumn="0" w:lastRowLastColumn="0"/>
+            <w:tcW w:w="0" w:type="auto"/>
+            <w:hideMark/>
+          </w:tcPr>
+          <w:p>
+            <w:pPr>
+              <w:pStyle w:val="Body"/>
+              <w:spacing w:after="160" w:line="259" w:lineRule="auto"/>
+              <w:rPr>
+                <w:sz w:val="16"/>
+                <w:szCs w:val="16"/>
+              </w:rPr>
+            </w:pPr>
+          </w:p>
+        </w:tc>
+        <w:tc>
+          <w:tcPr>
+            <w:tcW w:w="0" w:type="auto"/>
+            <w:hideMark/>
+          </w:tcPr>
+          <w:p>
+            <w:pPr>
+              <w:pStyle w:val="Body"/>
+              <w:spacing w:after="160" w:line="259" w:lineRule="auto"/>
+              <w:cnfStyle w:val="000000000000" w:firstRow="0" w:lastRow="0" w:firstColumn="0" w:lastColumn="0" w:oddVBand="0" w:evenVBand="0" w:oddHBand="0" w:evenHBand="0" w:firstRowFirstColumn="0" w:firstRowLastColumn="0" w:lastRowFirstColumn="0" w:lastRowLastColumn="0"/>
+              <w:rPr>
+                <w:sz w:val="16"/>
+                <w:szCs w:val="16"/>
+              </w:rPr>
+            </w:pPr>
+          </w:p>
+        </w:tc>
+        <w:tc>
+          <w:tcPr>
+            <w:tcW w:w="0" w:type="auto"/>
+            <w:hideMark/>
+          </w:tcPr>
+          <w:p>
+            <w:pPr>
+              <w:pStyle w:val="Body"/>
+              <w:spacing w:after="160" w:line="259" w:lineRule="auto"/>
+              <w:cnfStyle w:val="000000000000" w:firstRow="0" w:lastRow="0" w:firstColumn="0" w:lastColumn="0" w:oddVBand="0" w:evenVBand="0" w:oddHBand="0" w:evenHBand="0" w:firstRowFirstColumn="0" w:firstRowLastColumn="0" w:lastRowFirstColumn="0" w:lastRowLastColumn="0"/>
+              <w:rPr>
+                <w:sz w:val="16"/>
+                <w:szCs w:val="16"/>
+              </w:rPr>
+            </w:pPr>
+          </w:p>
+        </w:tc>
+        <w:tc>
+          <w:tcPr>
+            <w:tcW w:w="0" w:type="auto"/>
+            <w:hideMark/>
+          </w:tcPr>
+          <w:p>
+            <w:pPr>
+              <w:pStyle w:val="Body"/>
+              <w:spacing w:after="160" w:line="259" w:lineRule="auto"/>
+              <w:cnfStyle w:val="000000000000" w:firstRow="0" w:lastRow="0" w:firstColumn="0" w:lastColumn="0" w:oddVBand="0" w:evenVBand="0" w:oddHBand="0" w:evenHBand="0" w:firstRowFirstColumn="0" w:firstRowLastColumn="0" w:lastRowFirstColumn="0" w:lastRowLastColumn="0"/>
+              <w:rPr>
+                <w:sz w:val="16"/>
+                <w:szCs w:val="16"/>
+              </w:rPr>
+            </w:pPr>
+          </w:p>
+        </w:tc>
+        <w:tc>
+          <w:tcPr>
+            <w:tcW w:w="0" w:type="auto"/>
+            <w:hideMark/>
+          </w:tcPr>
+          <w:p>
+            <w:pPr>
+              <w:pStyle w:val="Body"/>
+              <w:spacing w:after="160" w:line="259" w:lineRule="auto"/>
+              <w:cnfStyle w:val="000000000000" w:firstRow="0" w:lastRow="0" w:firstColumn="0" w:lastColumn="0" w:oddVBand="0" w:evenVBand="0" w:oddHBand="0" w:evenHBand="0" w:firstRowFirstColumn="0" w:firstRowLastColumn="0" w:lastRowFirstColumn="0" w:lastRowLastColumn="0"/>
+              <w:rPr>
+                <w:sz w:val="16"/>
+                <w:szCs w:val="16"/>
+              </w:rPr>
+            </w:pPr>
+            <w:r>
+              <w:rPr>
+                <w:b/>
+                <w:bCs/>
+                <w:sz w:val="16"/>
+                <w:szCs w:val="16"/>
+              </w:rPr>
+              <w:t>Estimated Cost</w:t>
+            </w:r>
+          </w:p>
+        </w:tc>
+        <w:tc>
+          <w:tcPr>
+            <w:tcW w:w="0" w:type="auto"/>
+            <w:hideMark/>
+          </w:tcPr>
+          <w:p>
+            <w:pPr>
+              <w:pStyle w:val="Body"/>
+              <w:spacing w:after="160" w:line="259" w:lineRule="auto"/>
+              <w:cnfStyle w:val="000000000000" w:firstRow="0" w:lastRow="0" w:firstColumn="0" w:lastColumn="0" w:oddVBand="0" w:evenVBand="0" w:oddHBand="0" w:evenHBand="0" w:firstRowFirstColumn="0" w:firstRowLastColumn="0" w:lastRowFirstColumn="0" w:lastRowLastColumn="0"/>
+              <w:rPr>
+                <w:sz w:val="16"/>
+                <w:szCs w:val="16"/>
+              </w:rPr>
+            </w:pPr>
+            <w:r>
+              <w:rPr>
+                <w:b/>
+                <w:bCs/>
+                <w:sz w:val="16"/>
+                <w:szCs w:val="16"/>
+              </w:rPr>
+              <w:t>$9,734.00</w:t>
             </w:r>
           </w:p>
         </w:tc>
@@ -3442,54 +3716,17 @@
     <w:p>
       <w:pPr>
         <w:pStyle w:val="Body"/>
-        <w:rPr>
-          <w:rFonts w:ascii="SimSun" w:eastAsia="SimSun" w:hAnsi="SimSun" w:cs="SimSun"/>
-          <w:lang w:val="en-US" w:eastAsia="zh-CN"/>
-        </w:rPr>
       </w:pPr>
       <w:r>
-        <w:t>The total estimated cost of the proposed geotechnical engineering services is $6,169.50</w:t>
-      </w:r>
-      <w:r>
-        <w:rPr>
-          <w:rFonts w:ascii="SimSun" w:eastAsia="SimSun" w:hAnsi="SimSun" w:cs="SimSun"/>
-          <w:lang w:val="en-US" w:eastAsia="zh-CN"/>
-        </w:rPr>
-        <w:t>.</w:t>
-      </w:r>
-      <w:r>
-        <w:t xml:space="preserve"> </w:t>
-      </w:r>
-      <w:r>
-        <w:t>The estimated cost includes all professional service fees, surcharges, associated fees</w:t>
-      </w:r>
-      <w:r>
-        <w:t xml:space="preserve"> and does not include any traffic control and management if required</w:t>
-      </w:r>
-      <w:r>
-        <w:t xml:space="preserve"> and is valid for a period of 60 days from the date on the proposal. The estimated cost is based on the scope of work and assumptions described in this document and is exclusive of GST and any other applicable taxes. Invoices would be forwarded to the client monthly.</w:t>
+        <w:t>The total estimated geotechnical engineering project services cost for this work is $9,734.00. The estimated cost includes all professional service fees, surcharges, associated fees and is valid for a period of 60 days from the date on the proposal. The estimated cost is based on the scope of work and assumptions described in this document and is exclusive of GST and any other applicable taxes. Invoices would be forwarded to the client monthly.</w:t>
       </w:r>
     </w:p>
     <w:p>
       <w:pPr>
-        <w:pStyle w:val="Body"/>
-      </w:pPr>
-    </w:p>
-    <w:p>
-      <w:pPr>
-        <w:pStyle w:val="Body"/>
-      </w:pPr>
-    </w:p>
-    <w:p>
-      <w:pPr>
-        <w:pStyle w:val="Body"/>
-      </w:pPr>
-    </w:p>
-    <w:p>
-      <w:pPr>
         <w:pStyle w:val="Heading1"/>
       </w:pPr>
       <w:r>
+        <w:lastRenderedPageBreak/>
         <w:t>Terms and Conditions</w:t>
       </w:r>
     </w:p>
@@ -3498,7 +3735,7 @@
         <w:pStyle w:val="Body"/>
       </w:pPr>
       <w:r>
-        <w:t>Almor’s Standard Terms and Conditions and Work Authorization form accompany this proposal. Acceptance of this proposal constitutes acceptance of the Standard Terms and Conditions. Please initial the Terms and Conditions and complete the Work Authorization form. Both documents are required before the project begins. Almor will not exceed the estimated cost without prior Client approval.</w:t>
+        <w:t>Attached to this proposal is Almor’s Standard Terms and Conditions including a Work Authorization form. Acceptance of this proposal constitutes an acceptance of Almor’s Standard Terms and Conditions. Please initial the attached Standard Terms and Conditions document and complete the Work Authorization form. We require both documents completed prior to project initiation. Almor will not exceed the estimated cost without prior client approval.</w:t>
       </w:r>
     </w:p>
     <w:p>
@@ -3514,7 +3751,7 @@
         <w:pStyle w:val="Body"/>
       </w:pPr>
       <w:r>
-        <w:t xml:space="preserve">Almor is very interested in being part of the design team for this project. </w:t>
+        <w:t>Almor is very interested in being part of the design team for this project. We feel that our experience and strong geotechnical and materials engineering background will be an asset to the successful design and construction of the proposed multi-family residential building.</w:t>
       </w:r>
     </w:p>
     <w:p>
@@ -3629,9 +3866,10 @@
       </w:r>
       <w:r>
         <w:rPr>
+          <w:rFonts w:hint="eastAsia"/>
           <w:lang w:val="en-US" w:eastAsia="zh-CN"/>
         </w:rPr>
-        <w:t>, E.I.T.</w:t>
+        <w:t xml:space="preserve"> </w:t>
       </w:r>
       <w:r>
         <w:rPr>
@@ -3655,13 +3893,10 @@
         <w:t xml:space="preserve"> </w:t>
       </w:r>
       <w:r>
-        <w:t xml:space="preserve">  </w:t>
-      </w:r>
-      <w:r>
         <w:tab/>
       </w:r>
       <w:r>
-        <w:t>Abdul Alemi</w:t>
+        <w:t xml:space="preserve">           Abdul Alemi</w:t>
       </w:r>
       <w:r>
         <w:t>, P.Eng.</w:t>
@@ -3675,61 +3910,26 @@
         <w:rPr>
           <w:lang w:val="en-US"/>
         </w:rPr>
-        <w:t>Engineer-in-Training</w:t>
+        <w:t>Engineer In Training</w:t>
       </w:r>
       <w:r>
-        <w:rPr>
-          <w:lang w:val="en-US"/>
-        </w:rPr>
         <w:tab/>
       </w:r>
       <w:r>
-        <w:rPr>
-          <w:lang w:val="en-US"/>
-        </w:rPr>
         <w:tab/>
       </w:r>
       <w:r>
-        <w:rPr>
-          <w:lang w:val="en-US"/>
-        </w:rPr>
         <w:tab/>
       </w:r>
       <w:r>
-        <w:rPr>
-          <w:lang w:val="en-US"/>
-        </w:rPr>
         <w:tab/>
       </w:r>
       <w:r>
-        <w:rPr>
-          <w:lang w:val="en-US"/>
-        </w:rPr>
-        <w:tab/>
+        <w:t xml:space="preserve">                       Project </w:t>
       </w:r>
       <w:r>
-        <w:rPr>
-          <w:lang w:val="en-US"/>
-        </w:rPr>
-        <w:tab/>
+        <w:t>Engineer</w:t>
       </w:r>
-      <w:r>
-        <w:rPr>
-          <w:lang w:val="en-US"/>
-        </w:rPr>
-        <w:t>Project Engineer</w:t>
-      </w:r>
-    </w:p>
-    <w:p>
-      <w:pPr>
-        <w:spacing w:after="120"/>
-        <w:jc w:val="both"/>
-        <w:rPr>
-          <w:sz w:val="16"/>
-          <w:szCs w:val="16"/>
-          <w:lang w:eastAsia="zh-CN"/>
-        </w:rPr>
-      </w:pPr>
     </w:p>
     <w:p>
       <w:pPr>
@@ -3742,23 +3942,8 @@
         </w:rPr>
       </w:pPr>
       <w:r>
-        <w:rPr>
-          <w:sz w:val="16"/>
-          <w:szCs w:val="16"/>
-        </w:rPr>
-        <w:t>[Proposal Number] Road structure assessment</w:t>
+        <w:t>Proposal identifier</w:t>
       </w:r>
-    </w:p>
-    <w:p>
-      <w:pPr>
-        <w:spacing w:after="120"/>
-        <w:jc w:val="both"/>
-        <w:rPr>
-          <w:noProof/>
-          <w:sz w:val="16"/>
-          <w:szCs w:val="16"/>
-        </w:rPr>
-      </w:pPr>
     </w:p>
     <w:sectPr>
       <w:headerReference w:type="even" r:id="rId8"/>
@@ -4150,23 +4335,7 @@
                               <w:rFonts w:ascii="Arial" w:hAnsi="Arial" w:cs="Arial"/>
                               <w:color w:val="663300"/>
                             </w:rPr>
-                            <w:t xml:space="preserve">Road structure </w:t>
-                          </w:r>
-                          <w:proofErr w:type="gramStart"/>
-                          <w:r>
-                            <w:rPr>
-                              <w:rFonts w:ascii="Arial" w:hAnsi="Arial" w:cs="Arial"/>
-                              <w:color w:val="663300"/>
-                            </w:rPr>
-                            <w:t>and  capability</w:t>
-                          </w:r>
-                          <w:proofErr w:type="gramEnd"/>
-                          <w:r>
-                            <w:rPr>
-                              <w:rFonts w:ascii="Arial" w:hAnsi="Arial" w:cs="Arial"/>
-                              <w:color w:val="663300"/>
-                            </w:rPr>
-                            <w:t xml:space="preserve"> assessment</w:t>
+                            <w:t>Project NameProject NameProposal for Geotechnical ServicesAlmor Proposal No.: [Proposal Number]Project NameProject NameProposal for Geotechnical ServicesAlmor Proposal No.: [Proposal Number]</w:t>
                           </w:r>
                         </w:p>
                         <w:p>
@@ -4187,27 +4356,7 @@
                               <w:sz w:val="16"/>
                               <w:szCs w:val="16"/>
                             </w:rPr>
-                            <w:t xml:space="preserve">Road structure </w:t>
-                          </w:r>
-                          <w:proofErr w:type="gramStart"/>
-                          <w:r>
-                            <w:rPr>
-                              <w:rFonts w:ascii="Arial" w:hAnsi="Arial" w:cs="Arial"/>
-                              <w:color w:val="663300"/>
-                              <w:sz w:val="16"/>
-                              <w:szCs w:val="16"/>
-                            </w:rPr>
-                            <w:t>and  capability</w:t>
-                          </w:r>
-                          <w:proofErr w:type="gramEnd"/>
-                          <w:r>
-                            <w:rPr>
-                              <w:rFonts w:ascii="Arial" w:hAnsi="Arial" w:cs="Arial"/>
-                              <w:color w:val="663300"/>
-                              <w:sz w:val="16"/>
-                              <w:szCs w:val="16"/>
-                            </w:rPr>
-                            <w:t xml:space="preserve"> assessment</w:t>
+                            <w:t/>
                           </w:r>
                         </w:p>
                         <w:p>
@@ -4228,7 +4377,7 @@
                               <w:sz w:val="16"/>
                               <w:szCs w:val="16"/>
                             </w:rPr>
-                            <w:t>Proposal for Geotechnical Services</w:t>
+                            <w:t/>
                           </w:r>
                         </w:p>
                         <w:p>
@@ -4249,7 +4398,7 @@
                               <w:sz w:val="16"/>
                               <w:szCs w:val="16"/>
                             </w:rPr>
-                            <w:t>Almor Proposal No.: [Proposal Number]</w:t>
+                            <w:t/>
                           </w:r>
                         </w:p>
                       </w:txbxContent>
@@ -4275,7 +4424,7 @@
               <v:stroke joinstyle="miter"/>
               <v:path gradientshapeok="t" o:connecttype="rect"/>
             </v:shapetype>
-            <v:shape id="Text Box 2" o:spid="_x0000_s1026" type="#_x0000_t202" style="position:absolute;margin-left:290.25pt;margin-top:27pt;width:200.9pt;height:48.75pt;z-index:-251655168;visibility:visible;mso-wrap-style:square;mso-width-percent:0;mso-height-percent:0;mso-wrap-distance-left:9pt;mso-wrap-distance-top:3.6pt;mso-wrap-distance-right:9pt;mso-wrap-distance-bottom:3.6pt;mso-position-horizontal:absolute;mso-position-horizontal-relative:text;mso-position-vertical:absolute;mso-position-vertical-relative:page;mso-width-percent:0;mso-height-percent:0;mso-width-relative:margin;mso-height-relative:margin;v-text-anchor:top" o:gfxdata="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" filled="f" stroked="f">
+            <v:shape id="Text Box 2" o:spid="_x0000_s1026" type="#_x0000_t202" style="position:absolute;margin-left:290.25pt;margin-top:27pt;width:200.9pt;height:48.75pt;z-index:-251655168;visibility:visible;mso-wrap-style:square;mso-width-percent:0;mso-height-percent:0;mso-wrap-distance-left:9pt;mso-wrap-distance-top:3.6pt;mso-wrap-distance-right:9pt;mso-wrap-distance-bottom:3.6pt;mso-position-horizontal:absolute;mso-position-horizontal-relative:text;mso-position-vertical:absolute;mso-position-vertical-relative:page;mso-width-percent:0;mso-height-percent:0;mso-width-relative:margin;mso-height-relative:margin;v-text-anchor:top" o:gfxdata="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" filled="f" stroked="f">
               <v:textbox>
                 <w:txbxContent>
                   <w:p>
@@ -4292,7 +4441,7 @@
                         <w:rFonts w:ascii="Arial" w:hAnsi="Arial" w:cs="Arial"/>
                         <w:color w:val="663300"/>
                       </w:rPr>
-                      <w:t>Project Name</w:t>
+                      <w:t xml:space="preserve"/>
                     </w:r>
                   </w:p>
                   <w:p>
@@ -4313,7 +4462,7 @@
                         <w:sz w:val="16"/>
                         <w:szCs w:val="16"/>
                       </w:rPr>
-                      <w:t>Project Name</w:t>
+                      <w:t xml:space="preserve"/>
                     </w:r>
                   </w:p>
                   <w:p>
@@ -4334,7 +4483,7 @@
                         <w:sz w:val="16"/>
                         <w:szCs w:val="16"/>
                       </w:rPr>
-                      <w:t>Proposal for Geotechnical Services</w:t>
+                      <w:t/>
                     </w:r>
                   </w:p>
                   <w:p>
@@ -4355,7 +4504,7 @@
                         <w:sz w:val="16"/>
                         <w:szCs w:val="16"/>
                       </w:rPr>
-                      <w:t>Almor Proposal No.: [Proposal Number]</w:t>
+                      <w:t xml:space="preserve"/>
                     </w:r>
                   </w:p>
                 </w:txbxContent>
@@ -4438,7 +4587,7 @@
         </mc:Choice>
         <mc:Fallback xmlns="">
           <w:pict>
-            <v:line w14:anchorId="25630127" id="Straight Connector 2" o:spid="_x0000_s1026" style="position:absolute;flip:y;z-index:251663360;visibility:visible;mso-wrap-style:square;mso-width-percent:0;mso-height-percent:0;mso-wrap-distance-left:9pt;mso-wrap-distance-top:0;mso-wrap-distance-right:9pt;mso-wrap-distance-bottom:0;mso-position-horizontal:absolute;mso-position-horizontal-relative:text;mso-position-vertical:absolute;mso-position-vertical-relative:page;mso-width-percent:0;mso-height-percent:0;mso-width-relative:margin;mso-height-relative:margin" from="0,71.85pt" to="484.7pt,71.85pt" o:gfxdata="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" strokecolor="#630">
+            <v:line w14:anchorId="25630127" id="Straight Connector 2" o:spid="_x0000_s1026" style="position:absolute;flip:y;z-index:251663360;visibility:visible;mso-wrap-style:square;mso-width-percent:0;mso-height-percent:0;mso-wrap-distance-left:9pt;mso-wrap-distance-top:0;mso-wrap-distance-right:9pt;mso-wrap-distance-bottom:0;mso-position-horizontal:absolute;mso-position-horizontal-relative:text;mso-position-vertical:absolute;mso-position-vertical-relative:page;mso-width-percent:0;mso-height-percent:0;mso-width-relative:margin;mso-height-relative:margin" from="0,71.85pt" to="484.7pt,71.85pt" o:gfxdata="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" strokecolor="#630">
               <v:stroke joinstyle="miter"/>
               <w10:wrap anchory="page"/>
             </v:line>
@@ -4520,15 +4669,14 @@
                               <w:color w:val="663300"/>
                               <w:lang w:eastAsia="zh-CN"/>
                             </w:rPr>
-                            <w:t>Client Contact</w:t>
+                            <w:t xml:space="preserve"> Client NameProposal for Geotechnical Services Project Name, CalgaryAlmor Proposal No.: [Proposal Number] Client NameProposal for Geotechnical Services Project Name, CalgaryAlmor Proposal No.: [Proposal Number]</w:t>
                           </w:r>
                           <w:r>
                             <w:rPr>
                               <w:rFonts w:ascii="Arial" w:hAnsi="Arial" w:cs="Arial"/>
                               <w:color w:val="663300"/>
-                              <w:lang w:eastAsia="zh-CN"/>
                             </w:rPr>
-                            <w:t xml:space="preserve"> </w:t>
+                            <w:t/>
                           </w:r>
                         </w:p>
                         <w:p>
@@ -4549,7 +4697,7 @@
                               <w:sz w:val="16"/>
                               <w:szCs w:val="16"/>
                             </w:rPr>
-                            <w:t>Proposal for Geotechnical Services</w:t>
+                            <w:t/>
                           </w:r>
                         </w:p>
                         <w:p>
@@ -4571,7 +4719,17 @@
                               <w:szCs w:val="16"/>
                               <w:lang w:val="en-US"/>
                             </w:rPr>
-                            <w:t xml:space="preserve"> </w:t>
+                            <w:t xml:space="preserve"/>
+                          </w:r>
+                          <w:r>
+                            <w:rPr>
+                              <w:rFonts w:ascii="Arial" w:hAnsi="Arial" w:cs="Arial" w:hint="eastAsia"/>
+                              <w:color w:val="663300"/>
+                              <w:sz w:val="16"/>
+                              <w:szCs w:val="16"/>
+                              <w:lang w:val="en-US" w:eastAsia="zh-CN"/>
+                            </w:rPr>
+                            <w:t/>
                           </w:r>
                           <w:r>
                             <w:rPr>
@@ -4581,17 +4739,7 @@
                               <w:szCs w:val="16"/>
                               <w:lang w:val="en-US"/>
                             </w:rPr>
-                            <w:t xml:space="preserve">Project Location, </w:t>
-                          </w:r>
-                          <w:r>
-                            <w:rPr>
-                              <w:rFonts w:ascii="Arial" w:hAnsi="Arial" w:cs="Arial"/>
-                              <w:color w:val="663300"/>
-                              <w:sz w:val="16"/>
-                              <w:szCs w:val="16"/>
-                              <w:lang w:val="en-US"/>
-                            </w:rPr>
-                            <w:t>Calgary</w:t>
+                            <w:t/>
                           </w:r>
                         </w:p>
                         <w:p>
@@ -4612,7 +4760,7 @@
                               <w:sz w:val="16"/>
                               <w:szCs w:val="16"/>
                             </w:rPr>
-                            <w:t>Almor Proposal No.: [Proposal Number]</w:t>
+                            <w:t/>
                           </w:r>
                         </w:p>
                         <w:p>
@@ -4650,7 +4798,7 @@
               <v:stroke joinstyle="miter"/>
               <v:path gradientshapeok="t" o:connecttype="rect"/>
             </v:shapetype>
-            <v:shape id="_x0000_s1027" type="#_x0000_t202" style="position:absolute;margin-left:179.7pt;margin-top:30.55pt;width:326.55pt;height:48.75pt;z-index:-251649024;visibility:visible;mso-wrap-style:square;mso-width-percent:0;mso-height-percent:0;mso-wrap-distance-left:9pt;mso-wrap-distance-top:3.6pt;mso-wrap-distance-right:9pt;mso-wrap-distance-bottom:3.6pt;mso-position-horizontal:absolute;mso-position-horizontal-relative:text;mso-position-vertical:absolute;mso-position-vertical-relative:page;mso-width-percent:0;mso-height-percent:0;mso-width-relative:margin;mso-height-relative:margin;v-text-anchor:top" o:gfxdata="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" filled="f" stroked="f">
+            <v:shape id="_x0000_s1027" type="#_x0000_t202" style="position:absolute;margin-left:179.7pt;margin-top:30.55pt;width:326.55pt;height:48.75pt;z-index:-251649024;visibility:visible;mso-wrap-style:square;mso-width-percent:0;mso-height-percent:0;mso-wrap-distance-left:9pt;mso-wrap-distance-top:3.6pt;mso-wrap-distance-right:9pt;mso-wrap-distance-bottom:3.6pt;mso-position-horizontal:absolute;mso-position-horizontal-relative:text;mso-position-vertical:absolute;mso-position-vertical-relative:page;mso-width-percent:0;mso-height-percent:0;mso-width-relative:margin;mso-height-relative:margin;v-text-anchor:top" o:gfxdata="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" filled="f" stroked="f">
               <v:textbox>
                 <w:txbxContent>
                   <w:p>
@@ -4668,15 +4816,14 @@
                         <w:color w:val="663300"/>
                         <w:lang w:eastAsia="zh-CN"/>
                       </w:rPr>
-                      <w:t>Client Contact</w:t>
+                      <w:t xml:space="preserve"/>
                     </w:r>
                     <w:r>
                       <w:rPr>
                         <w:rFonts w:ascii="Arial" w:hAnsi="Arial" w:cs="Arial"/>
                         <w:color w:val="663300"/>
-                        <w:lang w:eastAsia="zh-CN"/>
                       </w:rPr>
-                      <w:t xml:space="preserve"> </w:t>
+                      <w:t/>
                     </w:r>
                   </w:p>
                   <w:p>
@@ -4697,7 +4844,7 @@
                         <w:sz w:val="16"/>
                         <w:szCs w:val="16"/>
                       </w:rPr>
-                      <w:t>Proposal for Geotechnical Services</w:t>
+                      <w:t/>
                     </w:r>
                   </w:p>
                   <w:p>
@@ -4719,7 +4866,17 @@
                         <w:szCs w:val="16"/>
                         <w:lang w:val="en-US"/>
                       </w:rPr>
-                      <w:t xml:space="preserve"> </w:t>
+                      <w:t xml:space="preserve"/>
+                    </w:r>
+                    <w:r>
+                      <w:rPr>
+                        <w:rFonts w:ascii="Arial" w:hAnsi="Arial" w:cs="Arial" w:hint="eastAsia"/>
+                        <w:color w:val="663300"/>
+                        <w:sz w:val="16"/>
+                        <w:szCs w:val="16"/>
+                        <w:lang w:val="en-US" w:eastAsia="zh-CN"/>
+                      </w:rPr>
+                      <w:t/>
                     </w:r>
                     <w:r>
                       <w:rPr>
@@ -4729,17 +4886,7 @@
                         <w:szCs w:val="16"/>
                         <w:lang w:val="en-US"/>
                       </w:rPr>
-                      <w:t xml:space="preserve">Project Location, </w:t>
-                    </w:r>
-                    <w:r>
-                      <w:rPr>
-                        <w:rFonts w:ascii="Arial" w:hAnsi="Arial" w:cs="Arial"/>
-                        <w:color w:val="663300"/>
-                        <w:sz w:val="16"/>
-                        <w:szCs w:val="16"/>
-                        <w:lang w:val="en-US"/>
-                      </w:rPr>
-                      <w:t>Calgary</w:t>
+                      <w:t/>
                     </w:r>
                   </w:p>
                   <w:p>
@@ -4760,7 +4907,7 @@
                         <w:sz w:val="16"/>
                         <w:szCs w:val="16"/>
                       </w:rPr>
-                      <w:t>Almor Proposal No.: [Proposal Number]</w:t>
+                      <w:t/>
                     </w:r>
                   </w:p>
                   <w:p>
@@ -4850,7 +4997,7 @@
         </mc:Choice>
         <mc:Fallback xmlns="">
           <w:pict>
-            <v:line w14:anchorId="16CADF06" id="Straight Connector 2" o:spid="_x0000_s1026" style="position:absolute;flip:y;z-index:251668480;visibility:visible;mso-wrap-style:square;mso-width-percent:0;mso-height-percent:0;mso-wrap-distance-left:9pt;mso-wrap-distance-top:0;mso-wrap-distance-right:9pt;mso-wrap-distance-bottom:0;mso-position-horizontal:absolute;mso-position-horizontal-relative:text;mso-position-vertical:absolute;mso-position-vertical-relative:text;mso-width-percent:0;mso-height-percent:0;mso-width-relative:margin;mso-height-relative:margin" from="0,13pt" to="498.85pt,13pt" o:gfxdata="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" strokecolor="#630">
+            <v:line w14:anchorId="16CADF06" id="Straight Connector 2" o:spid="_x0000_s1026" style="position:absolute;flip:y;z-index:251668480;visibility:visible;mso-wrap-style:square;mso-width-percent:0;mso-height-percent:0;mso-wrap-distance-left:9pt;mso-wrap-distance-top:0;mso-wrap-distance-right:9pt;mso-wrap-distance-bottom:0;mso-position-horizontal:absolute;mso-position-horizontal-relative:text;mso-position-vertical:absolute;mso-position-vertical-relative:text;mso-width-percent:0;mso-height-percent:0;mso-width-relative:margin;mso-height-relative:margin" from="0,13pt" to="498.85pt,13pt" o:gfxdata="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" strokecolor="#630">
               <v:stroke joinstyle="miter"/>
             </v:line>
           </w:pict>

</xml_diff>

<commit_message>
Add header rule and P026-173 personnel with normalized display names
</commit_message>
<xml_diff>
--- a/data/templates/standard_proposal.docx
+++ b/data/templates/standard_proposal.docx
@@ -88,6 +88,193 @@
       </w:pPr>
       <w:r>
         <w:t>At the request of the Client, Almor Testing Services Ltd. (Almor) is pleased to provide this proposal for geotechnical engineering services for the above-noted project.</w:t>
+      </w:r>
+    </w:p>
+    <w:p>
+      <w:pPr>
+        <w:pStyle w:val="Heading1"/>
+      </w:pPr>
+      <w:r>
+        <w:t>Proposed Project Personnel</w:t>
+      </w:r>
+    </w:p>
+    <w:p>
+      <w:pPr>
+        <w:pStyle w:val="Body"/>
+      </w:pPr>
+      <w:r>
+        <w:t>Almor</w:t>
+      </w:r>
+      <w:r>
+        <w:t xml:space="preserve"> is highly experienced in all aspects of geotechnical and materials engineering and testing.</w:t>
+      </w:r>
+      <w:r>
+        <w:t xml:space="preserve"> </w:t>
+      </w:r>
+      <w:r>
+        <w:t xml:space="preserve">Our proposed team has extensive experience </w:t>
+      </w:r>
+      <w:r>
+        <w:t xml:space="preserve">in </w:t>
+      </w:r>
+      <w:r>
+        <w:t xml:space="preserve">planning and conducting geotechnical site </w:t>
+      </w:r>
+      <w:r>
+        <w:t>assessments</w:t>
+      </w:r>
+      <w:r>
+        <w:t xml:space="preserve"> for </w:t>
+      </w:r>
+      <w:r>
+        <w:t>residential, commercial, and industrial projects including</w:t>
+      </w:r>
+      <w:r>
+        <w:t xml:space="preserve"> </w:t>
+      </w:r>
+      <w:r>
+        <w:t>slope stability analyses. Almor</w:t>
+      </w:r>
+      <w:r>
+        <w:t xml:space="preserve"> proposes to use the following dedicated personnel with proven track records in creativity, analysis and evaluation of geotechnical aspects for this project</w:t>
+      </w:r>
+      <w:r>
+        <w:t>.</w:t>
+      </w:r>
+    </w:p>
+    <w:p>
+      <w:pPr>
+        <w:pStyle w:val="Body"/>
+        <w:rPr>
+          <w:b/>
+          <w:bCs/>
+        </w:rPr>
+      </w:pPr>
+      <w:r>
+        <w:rPr>
+          <w:b/>
+          <w:bCs/>
+        </w:rPr>
+        <w:t xml:space="preserve">Project Manager – </w:t>
+      </w:r>
+      <w:r>
+        <w:rPr>
+          <w:b/>
+          <w:bCs/>
+        </w:rPr>
+        <w:t>Jason Morozoff</w:t>
+      </w:r>
+      <w:r>
+        <w:rPr>
+          <w:b/>
+          <w:bCs/>
+        </w:rPr>
+        <w:t>, P.Eng.</w:t>
+      </w:r>
+    </w:p>
+    <w:p>
+      <w:pPr>
+        <w:pStyle w:val="Body"/>
+      </w:pPr>
+      <w:r>
+        <w:t>Mr. Morozoff, P. Eng., is Almor’s principal officer and works as a project engineer on various projects. Over 25 years industry experience includes geotechnical site investigation, settlement analysis for deep fills and structural loading, grout mix design for structural and soil stabilization, project management, participating and coordinating staff/personnel for tendering and planning, attending and participating in field operations, quality control/assurance of project specifications.</w:t>
+      </w:r>
+    </w:p>
+    <w:p>
+      <w:pPr>
+        <w:pStyle w:val="Body"/>
+        <w:rPr>
+          <w:b/>
+          <w:bCs/>
+        </w:rPr>
+      </w:pPr>
+      <w:r>
+        <w:rPr>
+          <w:b/>
+          <w:bCs/>
+        </w:rPr>
+        <w:t>Project Engineer – Abdul Alemi, P.Eng.</w:t>
+      </w:r>
+    </w:p>
+    <w:p>
+      <w:pPr>
+        <w:pStyle w:val="Body"/>
+      </w:pPr>
+      <w:r>
+        <w:t xml:space="preserve">Mr. Alemi, </w:t>
+      </w:r>
+      <w:proofErr w:type="gramStart"/>
+      <w:r>
+        <w:t>P.Eng</w:t>
+      </w:r>
+      <w:proofErr w:type="gramEnd"/>
+      <w:r>
+        <w:t xml:space="preserve"> has over 15 years of experience in geotechnical engineering, construction monitoring and has been involved in managing a wide range of geotechnical and materials testing projects.</w:t>
+      </w:r>
+      <w:r>
+        <w:t xml:space="preserve"> </w:t>
+      </w:r>
+      <w:r>
+        <w:t xml:space="preserve">Mr. </w:t>
+      </w:r>
+      <w:r>
+        <w:t>Alemi</w:t>
+      </w:r>
+      <w:r>
+        <w:t xml:space="preserve"> will be responsible for coordinating the fieldwork and developing the geotechnical and materials recommendations for the project</w:t>
+      </w:r>
+      <w:r>
+        <w:t>.</w:t>
+      </w:r>
+    </w:p>
+    <w:p>
+      <w:pPr>
+        <w:pStyle w:val="Body"/>
+      </w:pPr>
+      <w:r>
+        <w:lastRenderedPageBreak/>
+        <w:t>Mr. Alemi’s engineering experience includes geotechnical site characterization, including trenchless crossings, deep and shallow foundation design analysis, pavement design and assessment, settlement analysis, and general site interpretation and recommendations.</w:t>
+      </w:r>
+    </w:p>
+    <w:p>
+      <w:pPr>
+        <w:pStyle w:val="Body"/>
+        <w:rPr>
+          <w:b/>
+          <w:bCs/>
+        </w:rPr>
+      </w:pPr>
+      <w:r>
+        <w:rPr>
+          <w:b/>
+          <w:bCs/>
+        </w:rPr>
+        <w:t>Senior Materials Engineering Technician/Field Supervisor – Jeremy Crawford</w:t>
+      </w:r>
+    </w:p>
+    <w:p>
+      <w:pPr>
+        <w:pStyle w:val="Body"/>
+      </w:pPr>
+      <w:r>
+        <w:t>Mr. Crawford has over twenty years of experience in geotechnical and materials engineering and has been involved with site developments and expansions. The focus of his activities has included the co-ordination of geotechnical and materials quality control testing programs, and project site supervision.</w:t>
+      </w:r>
+    </w:p>
+    <w:p>
+      <w:pPr>
+        <w:pStyle w:val="Body"/>
+      </w:pPr>
+      <w:r>
+        <w:t xml:space="preserve">Junior staff may be used under the direction </w:t>
+      </w:r>
+      <w:r>
+        <w:t xml:space="preserve">and guidance </w:t>
+      </w:r>
+      <w:r>
+        <w:t xml:space="preserve">of Mr. </w:t>
+      </w:r>
+      <w:r>
+        <w:t>Morozoff and Mr. Alemi.</w:t>
       </w:r>
     </w:p>
     <w:p>

</xml_diff>